<commit_message>
Caso Socorro Barón: correcciones de la revisión sustantiva (citas, hechos, intereses, cautelares, poder)
Co-Authored-By: Claude Fable 5.1 <noreply@anthropic.com>
Claude-Session: https://claude.ai/code/session_01WrAXCWtB2TRTF8KQgUauM9
</commit_message>
<xml_diff>
--- a/caso-socorro-baron/DEMANDA_EJECUTIVA_CARMEN_SOCORRO_BARON.docx
+++ b/caso-socorro-baron/DEMANDA_EJECUTIVA_CARMEN_SOCORRO_BARON.docx
@@ -723,7 +723,7 @@
           <w:b w:val="0"/>
           <w:i w:val="0"/>
         </w:rPr>
-        <w:t xml:space="preserve">, identificado con la cédula de ciudadanía No. 1.090.487.307, cuyas firmas, nombres y números de cédula constan de puño y letra en el anverso del título, en la casilla "ACEPTADA – GIRADOS", con lo cual quedaron obligados </w:t>
+        <w:t xml:space="preserve">, identificado con la cédula de ciudadanía No. 1.090.487.307, cuyas firmas y números de cédula constan de puño y letra en el anverso del título, en la casilla "ACEPTADA – GIRADOS" (en el caso de la demandada, junto con su nombre), con lo cual quedaron obligados </w:t>
       </w:r>
       <w:r>
         <w:rPr>
@@ -794,7 +794,7 @@
           <w:b w:val="0"/>
           <w:i w:val="0"/>
         </w:rPr>
-        <w:t xml:space="preserve"> el capital incorporado en el título, ni total ni parcialmente, pese a ser exigible; por lo tanto se encuentra en mora desde el </w:t>
+        <w:t xml:space="preserve"> la suma incorporada en el título, que se encuentra vencida y es exigible; por lo tanto se encuentra en mora desde el </w:t>
       </w:r>
       <w:r>
         <w:rPr>
@@ -809,7 +809,7 @@
           <w:b w:val="0"/>
           <w:i w:val="0"/>
         </w:rPr>
-        <w:t xml:space="preserve"> (artículos 1608 del Código Civil y 884 del Código de Comercio).</w:t>
+        <w:t xml:space="preserve"> (artículos 1608, numeral 1, del Código Civil y 782 y 884 del Código de Comercio).</w:t>
       </w:r>
     </w:p>
     <w:p>
@@ -1149,21 +1149,7 @@
           <w:b w:val="0"/>
           <w:i w:val="0"/>
         </w:rPr>
-        <w:t xml:space="preserve"> sobre dicho capital, liquidados a la </w:t>
-      </w:r>
-      <w:r>
-        <w:rPr>
-          <w:b/>
-          <w:i w:val="0"/>
-        </w:rPr>
-        <w:t>tasa máxima legal permitida</w:t>
-      </w:r>
-      <w:r>
-        <w:rPr>
-          <w:b w:val="0"/>
-          <w:i w:val="0"/>
-        </w:rPr>
-        <w:t xml:space="preserve">, esto es, una y media veces el interés bancario corriente certificado por la Superintendencia Financiera de Colombia para la modalidad de crédito de consumo y ordinario (artículo 884 del Código de Comercio), causados desde el </w:t>
+        <w:t xml:space="preserve"> sobre dicho capital, causados desde el </w:t>
       </w:r>
       <w:r>
         <w:rPr>
@@ -1178,7 +1164,21 @@
           <w:b w:val="0"/>
           <w:i w:val="0"/>
         </w:rPr>
-        <w:t>, día siguiente al vencimiento del título, y hasta la fecha en que se verifique el pago total de la obligación, sin exceder el límite de usura vigente para cada período.</w:t>
+        <w:t xml:space="preserve">, día siguiente al vencimiento del título, y hasta la fecha en que se verifique el pago total de la obligación, liquidados mes a mes a la </w:t>
+      </w:r>
+      <w:r>
+        <w:rPr>
+          <w:b/>
+          <w:i w:val="0"/>
+        </w:rPr>
+        <w:t>tasa máxima legal permitida</w:t>
+      </w:r>
+      <w:r>
+        <w:rPr>
+          <w:b w:val="0"/>
+          <w:i w:val="0"/>
+        </w:rPr>
+        <w:t>, equivalente a una y media veces el interés bancario corriente para la modalidad de crédito de consumo y ordinario certificado por la Superintendencia Financiera de Colombia para cada uno de los períodos de mora (artículos 884 del Código de Comercio y 431 del Código General del Proceso).</w:t>
       </w:r>
     </w:p>
     <w:p>
@@ -1316,7 +1316,7 @@
           <w:b w:val="0"/>
           <w:i w:val="0"/>
         </w:rPr>
-        <w:t xml:space="preserve"> artículos 619 a 622 (títulos valores; llenado de espacios en blanco), 625 (eficacia de la obligación cambiaria), 632 (solidaridad de los suscriptores), 671 (requisitos de la letra de cambio), 673 (formas de vencimiento), 676 (letra girada a la orden del mismo girador), 685 y 689 (aceptación y obligación del aceptante), 780 a 785 (acción cambiaria directa y solidaridad), 793 (acción ejecutiva), 884 (intereses moratorios) y 886.</w:t>
+        <w:t xml:space="preserve"> artículos 619, 620 y 621 (títulos valores y sus requisitos), 625 (eficacia de la obligación cambiaria), 632 (solidaridad de los suscriptores), 671 (requisitos de la letra de cambio), 673 (formas de vencimiento), 676 (letra girada a la orden del mismo girador), 685 y 689 (aceptación y obligación del aceptante), 780, 781, 782 y 785 (acción cambiaria directa y solidaridad), 793 (acción ejecutiva) y 884 (intereses moratorios).</w:t>
       </w:r>
     </w:p>
     <w:p>
@@ -1344,7 +1344,7 @@
           <w:b w:val="0"/>
           <w:i w:val="0"/>
         </w:rPr>
-        <w:t xml:space="preserve"> artículos 1568, 1571 y 1572 (solidaridad pasiva), 1602, 1608 (mora), 1617 (intereses) y 2221 y siguientes (mutuo).</w:t>
+        <w:t xml:space="preserve"> artículos 1568, 1571 y 1572 (solidaridad pasiva) y 1608 (mora).</w:t>
       </w:r>
     </w:p>
     <w:p>
@@ -1372,7 +1372,7 @@
           <w:b w:val="0"/>
           <w:i w:val="0"/>
         </w:rPr>
-        <w:t xml:space="preserve"> artículos 17 (numeral 1 y parágrafo), 25, 26 y 28 (numerales 1 y 3) (competencia y cuantía); 74 a 77 (poderes); 82 a 90 (demanda y anexos); 422 (título ejecutivo); 430, 431, 440, 442, 443 y 446 (proceso ejecutivo); 365 y 366 (costas); 593, 594 y 599 a 602 (medidas cautelares).</w:t>
+        <w:t xml:space="preserve"> artículos 17 (numeral 1 y parágrafo), 25, 26 y 28 (numerales 1 y 3) (competencia y cuantía); 74 a 77 (poderes); 82 a 90 (demanda y anexos); 422 (título ejecutivo); 430, 431, 440, 442, 443 y 446 (proceso ejecutivo); 365 y 366 (costas); 593, 594, 599 y 600 (medidas cautelares).</w:t>
       </w:r>
     </w:p>
     <w:p>
@@ -1441,7 +1441,7 @@
           <w:b w:val="0"/>
           <w:i w:val="0"/>
         </w:rPr>
-        <w:t>La circunstancia de que la demandante figure en el título como giradora y, a la vez, como beneficiaria, está expresamente autorizada por el artículo 676 del Código de Comercio ("la letra de cambio puede girarse a la orden o a cargo del mismo girador") y no afecta la existencia ni la eficacia del título, como lo ha reconocido la Corte Suprema de Justicia, Sala de Casación Civil, en la sentencia STC4164-2019 (2 de abril de 2019, M.P. Ariel Salazar Ramírez), al precisar que la ley no exige que la firma del creador ocupe un lugar determinado y que quien asume el doble carácter de girador y beneficiario no está obligado a duplicar su firma.</w:t>
+        <w:t>La circunstancia de que la demandante figure en el título como giradora y, a la vez, como beneficiaria, está expresamente autorizada por el artículo 676 del Código de Comercio ("la letra de cambio puede girarse a la orden o a cargo del mismo girador") y no afecta la existencia ni la eficacia del título.</w:t>
       </w:r>
     </w:p>
     <w:p>
@@ -1539,7 +1539,7 @@
           <w:b w:val="0"/>
           <w:i w:val="0"/>
         </w:rPr>
-        <w:t xml:space="preserve">), sumado a los intereses moratorios causados hasta la presentación de la demanda, no excede de cuarenta (40) salarios mínimos legales mensuales vigentes, equivalentes en 2026 a $70.036.200 (artículos 25 y 26, numeral 1, del Código General del Proceso; Decreto 1469 de 2025). Estimo la cuantía en la suma de </w:t>
+        <w:t xml:space="preserve">), no excede de cuarenta (40) salarios mínimos legales mensuales vigentes, equivalentes en 2026 a $70.036.200 (artículos 25 y 26, numeral 1, del Código General del Proceso; Decreto 1469 de 2025). Estimo la cuantía en la suma de </w:t>
       </w:r>
       <w:r>
         <w:rPr>
@@ -1553,22 +1553,7 @@
           <w:b w:val="0"/>
           <w:i w:val="0"/>
         </w:rPr>
-        <w:t xml:space="preserve"> más los intereses moratorios causados desde el </w:t>
-      </w:r>
-      <w:r>
-        <w:rPr>
-          <w:b/>
-          <w:i w:val="0"/>
-          <w:highlight w:val="yellow"/>
-        </w:rPr>
-        <w:t>9 de octubre de 2026</w:t>
-      </w:r>
-      <w:r>
-        <w:rPr>
-          <w:b w:val="0"/>
-          <w:i w:val="0"/>
-        </w:rPr>
-        <w:t>.</w:t>
+        <w:t>, valor de la pretensión mayor (artículo 26, numeral 1, CGP).</w:t>
       </w:r>
     </w:p>
     <w:p>
@@ -1673,14 +1658,14 @@
           <w:b/>
           <w:i w:val="0"/>
         </w:rPr>
-        <w:t>escrito separado</w:t>
+        <w:t>memorial separado</w:t>
       </w:r>
       <w:r>
         <w:rPr>
           <w:b w:val="0"/>
           <w:i w:val="0"/>
         </w:rPr>
-        <w:t xml:space="preserve"> que se acompaña a esta demanda, a fin de que no se incluya en el traslado a la ejecutada y se mantenga bajo reserva hasta la práctica de las medidas.</w:t>
+        <w:t>, que se radica junto con esta demanda pero no forma parte de sus anexos, a fin de que no se incluya en el traslado a la ejecutada y se mantenga bajo reserva hasta la práctica de las medidas.</w:t>
       </w:r>
     </w:p>
     <w:p>
@@ -1895,42 +1880,7 @@
           <w:b w:val="0"/>
           <w:i w:val="0"/>
         </w:rPr>
-        <w:t xml:space="preserve">3. Certificación de la Superintendencia Financiera de Colombia sobre el interés bancario corriente vigente para la modalidad de consumo y ordinario, correspondiente al mes de radicación de la demanda. </w:t>
-      </w:r>
-      <w:r>
-        <w:rPr>
-          <w:b/>
-          <w:i w:val="0"/>
-          <w:highlight w:val="yellow"/>
-        </w:rPr>
-        <w:t>Opcional: la tasa es un hecho notorio publicado por la Superfinanciera; se anexa para facilitar la liquidación.</w:t>
-      </w:r>
-    </w:p>
-    <w:p>
-      <w:pPr>
-        <w:spacing w:after="40" w:before="0"/>
-        <w:jc w:val="left"/>
-      </w:pPr>
-      <w:r>
-        <w:rPr>
-          <w:b/>
-          <w:i w:val="0"/>
-        </w:rPr>
-        <w:t>Oficios:</w:t>
-      </w:r>
-    </w:p>
-    <w:p>
-      <w:pPr>
-        <w:spacing w:after="120" w:before="0"/>
-        <w:ind w:left="425" w:hanging="425"/>
-        <w:jc w:val="both"/>
-      </w:pPr>
-      <w:r>
-        <w:rPr>
-          <w:b w:val="0"/>
-          <w:i w:val="0"/>
-        </w:rPr>
-        <w:t>1. Solicito oficiar a la Caja de Compensación Familiar del Oriente Colombiano – COMFAORIENTE para que certifique la vinculación laboral de la demandada, el cargo, el salario devengado y la forma de pago, con destino a este proceso (artículos 173 y 275 CGP).</w:t>
+        <w:t>3. Certificación de la Superintendencia Financiera de Colombia sobre el interés bancario corriente vigente para la modalidad de consumo y ordinario, correspondiente al mes de radicación de la demanda.</w:t>
       </w:r>
     </w:p>
     <w:p>
@@ -2059,7 +2009,7 @@
           <w:b w:val="0"/>
           <w:i w:val="0"/>
         </w:rPr>
-        <w:t>4. Escrito separado de solicitud de medidas cautelares (artículo 599 CGP).</w:t>
+        <w:t>4. Copia de la cédula de ciudadanía de la demandante.</w:t>
       </w:r>
     </w:p>
     <w:p>
@@ -2073,35 +2023,7 @@
           <w:b w:val="0"/>
           <w:i w:val="0"/>
         </w:rPr>
-        <w:t>5. Copia de la cédula de ciudadanía de la demandante.</w:t>
-      </w:r>
-    </w:p>
-    <w:p>
-      <w:pPr>
-        <w:spacing w:after="120" w:before="0"/>
-        <w:ind w:left="425" w:hanging="425"/>
-        <w:jc w:val="both"/>
-      </w:pPr>
-      <w:r>
-        <w:rPr>
-          <w:b w:val="0"/>
-          <w:i w:val="0"/>
-        </w:rPr>
-        <w:t>6. Los documentos relacionados en el acápite de pruebas.</w:t>
-      </w:r>
-    </w:p>
-    <w:p>
-      <w:pPr>
-        <w:spacing w:after="120" w:before="0"/>
-        <w:ind w:left="425" w:hanging="425"/>
-        <w:jc w:val="both"/>
-      </w:pPr>
-      <w:r>
-        <w:rPr>
-          <w:b w:val="0"/>
-          <w:i w:val="0"/>
-        </w:rPr>
-        <w:t>7. Copia de la demanda y de sus anexos para el archivo del Juzgado y para el traslado a la demandada, en formato digital (artículo 89 CGP y artículo 6 de la Ley 2213 de 2022).</w:t>
+        <w:t>5. Los documentos relacionados en el acápite de pruebas.</w:t>
       </w:r>
     </w:p>
     <w:p>
@@ -2257,7 +2179,7 @@
           <w:b/>
           <w:i w:val="0"/>
         </w:rPr>
-        <w:t>Apoderada sustituta:</w:t>
+        <w:t>Apoderada suplente:</w:t>
       </w:r>
       <w:r>
         <w:rPr>
@@ -2335,22 +2257,7 @@
           <w:i w:val="0"/>
           <w:highlight w:val="yellow"/>
         </w:rPr>
-        <w:t>CELULAR DE LA DEMANDADA, si se conoce</w:t>
-      </w:r>
-      <w:r>
-        <w:rPr>
-          <w:b w:val="0"/>
-          <w:i w:val="0"/>
-        </w:rPr>
-        <w:t xml:space="preserve">. Correo electrónico: </w:t>
-      </w:r>
-      <w:r>
-        <w:rPr>
-          <w:b/>
-          <w:i w:val="0"/>
-          <w:highlight w:val="yellow"/>
-        </w:rPr>
-        <w:t>CORREO DE LA DEMANDADA, si se conoce; de lo contrario dejar la manifestación siguiente</w:t>
+        <w:t>CELULAR DE LA DEMANDADA</w:t>
       </w:r>
       <w:r>
         <w:rPr>
@@ -2441,7 +2348,7 @@
           <w:b w:val="0"/>
           <w:i w:val="0"/>
         </w:rPr>
-        <w:t xml:space="preserve"> de la Rama Judicial (procesojudicial.ramajudicial.gov.co/demandaenlinea), habilitada para el Distrito Judicial de Cúcuta, conforme a los artículos 3 y 6 de la Ley 2213 de 2022 y 89 del Código General del Proceso; los documentos aportados se presumen auténticos (artículo 244 CGP).</w:t>
+        <w:t xml:space="preserve"> de la Rama Judicial (procesojudicial.ramajudicial.gov.co/demandaenlinea), habilitada para el Distrito Judicial de Cúcuta, conforme a los artículos 3 y 6 de la Ley 2213 de 2022; los documentos aportados se presumen auténticos (artículo 244 CGP).</w:t>
       </w:r>
     </w:p>
     <w:p>
@@ -2483,7 +2390,7 @@
           <w:b w:val="0"/>
           <w:i w:val="0"/>
         </w:rPr>
-        <w:t>, no en copia, a disposición del Despacho y de la ejecutada para su exhibición física o virtual cuando se requiera, y que el original físico se entregará al Juzgado para su custodia; y (iii) que el título no ha sido endosado, cedido ni entregado en garantía a tercero alguno, y que su circulación cesa desde la presentación de esta demanda.</w:t>
+        <w:t>, no en copia, que se allega escaneado por ambas caras en un solo archivo PDF, a disposición del Despacho y de la ejecutada para su exhibición física o virtual cuando se requiera, y que el original físico se entregará al Juzgado para su custodia; y (iii) que el título no ha sido endosado, cedido ni entregado en garantía a tercero alguno, y que su circulación cesa desde la presentación de esta demanda.</w:t>
       </w:r>
     </w:p>
     <w:p>

</xml_diff>

<commit_message>
Caso Socorro Barón: versión revisada final (tres revisiones estrictas incorporadas)
Co-Authored-By: Claude Fable 5.1 <noreply@anthropic.com>
Claude-Session: https://claude.ai/code/session_01WrAXCWtB2TRTF8KQgUauM9
</commit_message>
<xml_diff>
--- a/caso-socorro-baron/DEMANDA_EJECUTIVA_CARMEN_SOCORRO_BARON.docx
+++ b/caso-socorro-baron/DEMANDA_EJECUTIVA_CARMEN_SOCORRO_BARON.docx
@@ -25,7 +25,7 @@
           <w:b/>
           <w:i w:val="0"/>
         </w:rPr>
-        <w:t>JUEZ MUNICIPAL DE PEQUEÑAS CAUSAS Y COMPETENCIA MÚLTIPLE (O CIVIL MUNICIPAL) DE SAN JOSÉ DE CÚCUTA – REPARTO</w:t>
+        <w:t>JUEZ MUNICIPAL DE PEQUEÑAS CAUSAS Y COMPETENCIA MÚLTIPLE DE SAN JOSÉ DE CÚCUTA (REPARTO)</w:t>
       </w:r>
     </w:p>
     <w:p>
@@ -399,7 +399,15 @@
           <w:b/>
           <w:i w:val="0"/>
         </w:rPr>
-        <w:t>MARÍA DEL PILAR BARÓN [[GALINDO]]</w:t>
+        <w:t xml:space="preserve">MARÍA DEL PILAR BARÓN </w:t>
+      </w:r>
+      <w:r>
+        <w:rPr>
+          <w:b/>
+          <w:i w:val="0"/>
+          <w:highlight w:val="yellow"/>
+        </w:rPr>
+        <w:t>GALINDO</w:t>
       </w:r>
       <w:r>
         <w:rPr>
@@ -421,7 +429,7 @@
           <w:i w:val="0"/>
           <w:sz w:val="24"/>
         </w:rPr>
-        <w:t>I. PARTES Y SUS REPRESENTANTES (ART. 82, NUM. 2, CGP)</w:t>
+        <w:t>I. PARTES Y SUS REPRESENTANTES (ART. 82, NUMS. 2 Y 3, CGP)</w:t>
       </w:r>
     </w:p>
     <w:p>
@@ -600,7 +608,15 @@
           <w:b/>
           <w:i w:val="0"/>
         </w:rPr>
-        <w:t>letra de cambio No. [[001]]</w:t>
+        <w:t xml:space="preserve">letra de cambio No. </w:t>
+      </w:r>
+      <w:r>
+        <w:rPr>
+          <w:b/>
+          <w:i w:val="0"/>
+          <w:highlight w:val="yellow"/>
+        </w:rPr>
+        <w:t>001</w:t>
       </w:r>
       <w:r>
         <w:rPr>
@@ -629,7 +645,15 @@
           <w:b/>
           <w:i w:val="0"/>
         </w:rPr>
-        <w:t>$[[21.106.522]]</w:t>
+        <w:t>$</w:t>
+      </w:r>
+      <w:r>
+        <w:rPr>
+          <w:b/>
+          <w:i w:val="0"/>
+          <w:highlight w:val="yellow"/>
+        </w:rPr>
+        <w:t>21.106.522</w:t>
       </w:r>
       <w:r>
         <w:rPr>
@@ -651,14 +675,22 @@
           <w:b w:val="0"/>
           <w:i w:val="0"/>
         </w:rPr>
-        <w:t xml:space="preserve"> moneda legal colombiana), pagadera en San José de Cúcuta en una sola cuota, con </w:t>
+        <w:t xml:space="preserve"> moneda legal colombiana, M/CTE), pagadera en San José de Cúcuta en una sola cuota, con </w:t>
       </w:r>
       <w:r>
         <w:rPr>
           <w:b/>
           <w:i w:val="0"/>
         </w:rPr>
-        <w:t>vencimiento el [[8 de octubre de 2026]]</w:t>
+        <w:t xml:space="preserve">vencimiento el </w:t>
+      </w:r>
+      <w:r>
+        <w:rPr>
+          <w:b/>
+          <w:i w:val="0"/>
+          <w:highlight w:val="yellow"/>
+        </w:rPr>
+        <w:t>8 de octubre de 2026</w:t>
       </w:r>
       <w:r>
         <w:rPr>
@@ -723,7 +755,7 @@
           <w:b w:val="0"/>
           <w:i w:val="0"/>
         </w:rPr>
-        <w:t xml:space="preserve">, identificado con la cédula de ciudadanía No. 1.090.487.307, cuyas firmas y números de cédula constan de puño y letra en el anverso del título, en la casilla "ACEPTADA – GIRADOS" (en el caso de la demandada, junto con su nombre), con lo cual quedaron obligados </w:t>
+        <w:t xml:space="preserve">, identificado con la cédula de ciudadanía No. 1.090.487.307, cuyas firmas y números de cédula constan de puño y letra en el anverso del título, en la casilla "ACEPTADA – GIRADOS", con lo cual quedaron obligados </w:t>
       </w:r>
       <w:r>
         <w:rPr>
@@ -908,7 +940,22 @@
           <w:b w:val="0"/>
           <w:i w:val="0"/>
         </w:rPr>
-        <w:t xml:space="preserve"> de la Oficina de Registro de Instrumentos Públicos de Cúcuta, ubicado en la Calle 22 A No. 4-101, Apartamento 102, Urbanización Prados del Norte, de esta ciudad, según el certificado de tradición y libertad que se anexa.</w:t>
+        <w:t xml:space="preserve"> de la Oficina de Registro de Instrumentos Públicos de Cúcuta, ubicado en la Calle 22 A No. 4-101, Apartamento 102, Manzana N, Urbanización Prados del Norte (Ures 20), de esta ciudad </w:t>
+      </w:r>
+      <w:r>
+        <w:rPr>
+          <w:b/>
+          <w:i w:val="0"/>
+          <w:highlight w:val="yellow"/>
+        </w:rPr>
+        <w:t>transcribir la dirección tal como figure en el certificado de tradición</w:t>
+      </w:r>
+      <w:r>
+        <w:rPr>
+          <w:b w:val="0"/>
+          <w:i w:val="0"/>
+        </w:rPr>
+        <w:t>, según el certificado de tradición y libertad que se anexa.</w:t>
       </w:r>
     </w:p>
     <w:p>
@@ -936,7 +983,7 @@
           <w:b w:val="0"/>
           <w:i w:val="0"/>
         </w:rPr>
-        <w:t>9. La demandante confirió poder especial a los suscritos abogados para la presentación de esta demanda, conforme al artículo 5 de la Ley 2213 de 2022.</w:t>
+        <w:t>9. La demandante confirió poder especial al suscrito apoderado y a la doctora DANIELA YULIANA BOTIA DURÁN, como apoderada suplente, mediante mensaje de datos, conforme al artículo 5 de la Ley 2213 de 2022.</w:t>
       </w:r>
     </w:p>
     <w:p>
@@ -1013,7 +1060,15 @@
           <w:b/>
           <w:i w:val="0"/>
         </w:rPr>
-        <w:t>MARÍA DEL PILAR BARÓN [[GALINDO]]</w:t>
+        <w:t xml:space="preserve">MARÍA DEL PILAR BARÓN </w:t>
+      </w:r>
+      <w:r>
+        <w:rPr>
+          <w:b/>
+          <w:i w:val="0"/>
+          <w:highlight w:val="yellow"/>
+        </w:rPr>
+        <w:t>GALINDO</w:t>
       </w:r>
       <w:r>
         <w:rPr>
@@ -1041,7 +1096,15 @@
           <w:b/>
           <w:i w:val="0"/>
         </w:rPr>
-        <w:t>a) $[[21.106.522]]</w:t>
+        <w:t>a) $</w:t>
+      </w:r>
+      <w:r>
+        <w:rPr>
+          <w:b/>
+          <w:i w:val="0"/>
+          <w:highlight w:val="yellow"/>
+        </w:rPr>
+        <w:t>21.106.522</w:t>
       </w:r>
       <w:r>
         <w:rPr>
@@ -1212,7 +1275,7 @@
           <w:b w:val="0"/>
           <w:i w:val="0"/>
         </w:rPr>
-        <w:t xml:space="preserve"> en la forma prevista en el artículo 440 del Código General del Proceso, si la demandada no propone excepciones o si las propuestas no prosperan, y en consecuencia disponer el remate y la venta en pública subasta de los bienes embargados y la práctica de la liquidación del crédito (artículo 446 CGP).</w:t>
+        <w:t xml:space="preserve"> en la forma prevista en el artículo 440 del Código General del Proceso, si la demandada no propone excepciones o si las propuestas no prosperan, y en consecuencia disponer el remate y la venta en pública subasta de los bienes embargados y, en su oportunidad, la práctica de la liquidación del crédito y de las costas (artículo 446 CGP).</w:t>
       </w:r>
     </w:p>
     <w:p>
@@ -1546,7 +1609,15 @@
           <w:b/>
           <w:i w:val="0"/>
         </w:rPr>
-        <w:t>$[[21.106.522]]</w:t>
+        <w:t>$</w:t>
+      </w:r>
+      <w:r>
+        <w:rPr>
+          <w:b/>
+          <w:i w:val="0"/>
+          <w:highlight w:val="yellow"/>
+        </w:rPr>
+        <w:t>21.106.522</w:t>
       </w:r>
       <w:r>
         <w:rPr>
@@ -1859,14 +1930,14 @@
           <w:i w:val="0"/>
           <w:highlight w:val="yellow"/>
         </w:rPr>
-        <w:t>FECHA DE EXPEDICIÓN</w:t>
+        <w:t>FECHA DE EXPEDICIÓN, dentro de los 30 días anteriores a la radicación</w:t>
       </w:r>
       <w:r>
         <w:rPr>
           <w:b w:val="0"/>
           <w:i w:val="0"/>
         </w:rPr>
-        <w:t>, con vigencia inferior a treinta (30) días.</w:t>
+        <w:t>.</w:t>
       </w:r>
     </w:p>
     <w:p>
@@ -1909,7 +1980,7 @@
           <w:b w:val="0"/>
           <w:i w:val="0"/>
         </w:rPr>
-        <w:t xml:space="preserve">1. Poder especial conferido por la demandante a los suscritos abogados, otorgado por mensaje de datos (artículo 5, Ley 2213 de 2022), junto con la impresión del correo electrónico mediante el cual la poderdante lo remitió desde su cuenta </w:t>
+        <w:t xml:space="preserve">1. Poder especial conferido por la demandante al suscrito apoderado y a la apoderada suplente, otorgado por mensaje de datos (artículo 5, Ley 2213 de 2022), junto con la impresión del correo electrónico mediante el cual la poderdante lo remitió desde su cuenta </w:t>
       </w:r>
       <w:r>
         <w:rPr>
@@ -2138,35 +2209,21 @@
           <w:b w:val="0"/>
           <w:i w:val="0"/>
         </w:rPr>
-        <w:t xml:space="preserve">, San José de Cúcuta; celular 320 449 2882; correos electrónicos </w:t>
+        <w:t xml:space="preserve">, San José de Cúcuta; celular 320 449 2882; </w:t>
       </w:r>
       <w:r>
         <w:rPr>
           <w:b/>
           <w:i w:val="0"/>
         </w:rPr>
-        <w:t>djbc23@hotmail.com</w:t>
+        <w:t>canal digital único para notificaciones: djbc23@hotmail.com</w:t>
       </w:r>
       <w:r>
         <w:rPr>
           <w:b w:val="0"/>
           <w:i w:val="0"/>
         </w:rPr>
-        <w:t xml:space="preserve"> y </w:t>
-      </w:r>
-      <w:r>
-        <w:rPr>
-          <w:b/>
-          <w:i w:val="0"/>
-        </w:rPr>
-        <w:t>abogadossasramosmejia@gmail.com</w:t>
-      </w:r>
-      <w:r>
-        <w:rPr>
-          <w:b w:val="0"/>
-          <w:i w:val="0"/>
-        </w:rPr>
-        <w:t>, canal digital que se designa para todos los efectos del proceso (artículo 3, Ley 2213 de 2022).</w:t>
+        <w:t xml:space="preserve"> (inscrito en el Registro Nacional de Abogados); correo alterno solo para contacto: abogadossasramosmejia@gmail.com (artículo 3, Ley 2213 de 2022).</w:t>
       </w:r>
     </w:p>
     <w:p>
@@ -2179,7 +2236,7 @@
           <w:b/>
           <w:i w:val="0"/>
         </w:rPr>
-        <w:t>Apoderada suplente:</w:t>
+        <w:t>Apoderada suplente (únicamente en ausencia del principal):</w:t>
       </w:r>
       <w:r>
         <w:rPr>
@@ -2193,7 +2250,7 @@
           <w:b/>
           <w:i w:val="0"/>
         </w:rPr>
-        <w:t>Danielabotia_03@hotmail.com</w:t>
+        <w:t>danielabotia_03@hotmail.com</w:t>
       </w:r>
       <w:r>
         <w:rPr>
@@ -2418,7 +2475,21 @@
           <w:b w:val="0"/>
           <w:i w:val="0"/>
         </w:rPr>
-        <w:t>4. El proceso ejecutivo no está sujeto al requisito de procedibilidad de la conciliación extrajudicial.</w:t>
+        <w:t>4. El proceso ejecutivo no está sujeto al requisito de procedibilidad de la conciliación extrajudicial, que la Ley 2220 de 2022 reserva a los procesos declarativos; además, se solicitan medidas cautelares.</w:t>
+      </w:r>
+    </w:p>
+    <w:p>
+      <w:pPr>
+        <w:spacing w:after="120" w:before="0"/>
+        <w:ind w:left="425" w:hanging="425"/>
+        <w:jc w:val="both"/>
+      </w:pPr>
+      <w:r>
+        <w:rPr>
+          <w:b w:val="0"/>
+          <w:i w:val="0"/>
+        </w:rPr>
+        <w:t>5. No se presenta juramento estimatorio, por no reclamarse indemnización, compensación, frutos ni mejoras (artículo 206 CGP); el capital y los intereses se determinan por el título y la ley.</w:t>
       </w:r>
     </w:p>
     <w:p>
@@ -2431,7 +2502,7 @@
           <w:b w:val="0"/>
           <w:i w:val="0"/>
         </w:rPr>
-        <w:t>Del señor(a) Juez, atentamente,</w:t>
+        <w:t>Atentamente,</w:t>
       </w:r>
     </w:p>
     <w:p>

</xml_diff>